<commit_message>
This chapter is starting to look like an ending or a beginning of an ending.
</commit_message>
<xml_diff>
--- a/Chapter 021 - Cubit.docx
+++ b/Chapter 021 - Cubit.docx
@@ -102,7 +102,13 @@
     </w:p>
     <w:p>
       <w:r>
-        <w:t>“You weren’t to know.”</w:t>
+        <w:t>“You weren’t to know</w:t>
+      </w:r>
+      <w:r>
+        <w:t xml:space="preserve"> sir.</w:t>
+      </w:r>
+      <w:r>
+        <w:t>”</w:t>
       </w:r>
     </w:p>
     <w:p>
@@ -121,11 +127,30 @@
     </w:p>
     <w:p>
       <w:r>
-        <w:t>“What?”</w:t>
-      </w:r>
-      <w:r>
-        <w:br/>
-        <w:t>“Sorry, he’s just leaving the house. I was wondering if I should follow.”</w:t>
+        <w:t>“</w:t>
+      </w:r>
+      <w:proofErr w:type="gramStart"/>
+      <w:r>
+        <w:t>What</w:t>
+      </w:r>
+      <w:r>
+        <w:t xml:space="preserve"> ?</w:t>
+      </w:r>
+      <w:r>
+        <w:t>Sorry</w:t>
+      </w:r>
+      <w:proofErr w:type="gramEnd"/>
+      <w:r>
+        <w:t>?</w:t>
+      </w:r>
+      <w:r>
+        <w:t xml:space="preserve"> </w:t>
+      </w:r>
+      <w:r>
+        <w:t>H</w:t>
+      </w:r>
+      <w:r>
+        <w:t>e’s just leaving the house. I was wondering if I should follow.”</w:t>
       </w:r>
       <w:r>
         <w:br/>
@@ -187,7 +212,10 @@
     </w:p>
     <w:p>
       <w:r>
-        <w:t xml:space="preserve">“OK, dad I won’t adopt that tone. If you’d called me straight </w:t>
+        <w:t>“OK, dad I won’t adopt that tone. If you’d called me straight</w:t>
+      </w:r>
+      <w:r>
+        <w:t>-</w:t>
       </w:r>
       <w:proofErr w:type="gramStart"/>
       <w:r>
@@ -195,7 +223,34 @@
       </w:r>
       <w:proofErr w:type="gramEnd"/>
       <w:r>
-        <w:t xml:space="preserve"> we wouldn’t be in this fucking mess. We could have broken in and had a look around while Klee was out. We could have left ourselves an easy way so we could have a look around every time he was out until we found it. But no. You had to go with some local morons. And so</w:t>
+        <w:t xml:space="preserve"> we wouldn’t be in this fucking mess. We could have broken in and had a look around while Klee was out. We could have left ourselves an easy way</w:t>
+      </w:r>
+      <w:r>
+        <w:t>.</w:t>
+      </w:r>
+      <w:r>
+        <w:t xml:space="preserve"> </w:t>
+      </w:r>
+      <w:proofErr w:type="gramStart"/>
+      <w:r>
+        <w:t>S</w:t>
+      </w:r>
+      <w:r>
+        <w:t>o</w:t>
+      </w:r>
+      <w:proofErr w:type="gramEnd"/>
+      <w:r>
+        <w:t xml:space="preserve"> we could have a look around </w:t>
+      </w:r>
+      <w:r>
+        <w:rPr>
+          <w:i/>
+          <w:iCs/>
+        </w:rPr>
+        <w:t xml:space="preserve">every </w:t>
+      </w:r>
+      <w:r>
+        <w:t>time he was out until we found it. But no. You had to go with some local morons. And so</w:t>
       </w:r>
       <w:r>
         <w:t>,</w:t>
@@ -246,15 +301,18 @@
         <w:t xml:space="preserve"> But if he</w:t>
       </w:r>
       <w:r>
-        <w:t xml:space="preserve"> does find it, he’s surely not just going to load it in the back of his car and drive off. That’s </w:t>
-      </w:r>
-      <w:proofErr w:type="gramStart"/>
-      <w:r>
-        <w:t>a point</w:t>
-      </w:r>
-      <w:proofErr w:type="gramEnd"/>
-      <w:r>
-        <w:t>. What if it’s in the garage. We could check in the garage.</w:t>
+        <w:t xml:space="preserve"> does find it, he’s surely not just going to load it in the back of his car and drive off.</w:t>
+      </w:r>
+      <w:r>
+        <w:t>”</w:t>
+      </w:r>
+    </w:p>
+    <w:p>
+      <w:r>
+        <w:t>“</w:t>
+      </w:r>
+      <w:r>
+        <w:t>That’s a point. What if it’s in the garage. We could check in the garage.</w:t>
       </w:r>
       <w:r>
         <w:t>”</w:t>
@@ -347,7 +405,21 @@
       </w:r>
       <w:r>
         <w:br/>
-        <w:t>“Don’t talk about mum.”</w:t>
+        <w:t>“Don’t talk about mum</w:t>
+      </w:r>
+      <w:r>
+        <w:t xml:space="preserve"> like that. Just. </w:t>
+      </w:r>
+      <w:proofErr w:type="gramStart"/>
+      <w:r>
+        <w:t>Actually, just</w:t>
+      </w:r>
+      <w:proofErr w:type="gramEnd"/>
+      <w:r>
+        <w:t>, don’t talk about mum.</w:t>
+      </w:r>
+      <w:r>
+        <w:t>”</w:t>
       </w:r>
     </w:p>
     <w:p>
@@ -371,22 +443,44 @@
       </w:r>
       <w:proofErr w:type="gramEnd"/>
       <w:r>
-        <w:t xml:space="preserve"> there’s no laughter in her.”</w:t>
-      </w:r>
-    </w:p>
-    <w:p>
-      <w:r>
-        <w:t>“There wasn’t much laughter in her after she found out you’d been in Debbie.”</w:t>
-      </w:r>
-    </w:p>
-    <w:p>
-      <w:r>
-        <w:t>“I’ve got an idea.”</w:t>
-      </w:r>
-    </w:p>
-    <w:p>
-      <w:r>
-        <w:t>“What how I can get your mum back.”</w:t>
+        <w:t xml:space="preserve"> there’s no laughter in</w:t>
+      </w:r>
+      <w:r>
+        <w:t>side</w:t>
+      </w:r>
+      <w:r>
+        <w:t xml:space="preserve"> her.”</w:t>
+      </w:r>
+    </w:p>
+    <w:p>
+      <w:r>
+        <w:t>“There wasn’t much laughter in her after she found out you’d been in</w:t>
+      </w:r>
+      <w:r>
+        <w:t>side</w:t>
+      </w:r>
+      <w:r>
+        <w:t xml:space="preserve"> Debbie.</w:t>
+      </w:r>
+      <w:r>
+        <w:t xml:space="preserve"> Oh, this this is pointless, listen, </w:t>
+      </w:r>
+      <w:r>
+        <w:t>I’ve got an idea.</w:t>
+      </w:r>
+      <w:r>
+        <w:t>”</w:t>
+      </w:r>
+    </w:p>
+    <w:p>
+      <w:r>
+        <w:t>“What how I can get your mum back</w:t>
+      </w:r>
+      <w:r>
+        <w:t>?</w:t>
+      </w:r>
+      <w:r>
+        <w:t>”</w:t>
       </w:r>
       <w:r>
         <w:br/>
@@ -395,7 +489,18 @@
     </w:p>
     <w:p>
       <w:r>
-        <w:t>“What then.”</w:t>
+        <w:t>“What then</w:t>
+      </w:r>
+      <w:r>
+        <w:t>?</w:t>
+      </w:r>
+      <w:r>
+        <w:t>”</w:t>
+      </w:r>
+    </w:p>
+    <w:p>
+      <w:r>
+        <w:t>“How to get in there.”</w:t>
       </w:r>
     </w:p>
     <w:p>
@@ -418,30 +523,14 @@
     </w:p>
     <w:p>
       <w:r>
-        <w:t>“Whatever.</w:t>
-      </w:r>
-      <w:r>
-        <w:t xml:space="preserve"> I need a hard hat, </w:t>
-      </w:r>
-      <w:r>
-        <w:t xml:space="preserve">a </w:t>
-      </w:r>
-      <w:proofErr w:type="spellStart"/>
-      <w:r>
-        <w:t>hi-viz</w:t>
-      </w:r>
-      <w:proofErr w:type="spellEnd"/>
-      <w:r>
-        <w:t xml:space="preserve"> jacket, </w:t>
-      </w:r>
-      <w:r>
-        <w:t xml:space="preserve">a laminator and a </w:t>
-      </w:r>
-      <w:proofErr w:type="gramStart"/>
-      <w:r>
-        <w:t>clipboard.”</w:t>
-      </w:r>
-      <w:proofErr w:type="gramEnd"/>
+        <w:t>“Whatever</w:t>
+      </w:r>
+      <w:r>
+        <w:t>, you’re going to need a hard had, a laminator and a clipboard.</w:t>
+      </w:r>
+      <w:r>
+        <w:t>”</w:t>
+      </w:r>
     </w:p>
     <w:sectPr>
       <w:pgSz w:w="11906" w:h="16838"/>

</xml_diff>